<commit_message>
docx: map Title/Subtitle styles, strip bookmark anchors, unescape noise
Manual QA with a real (Google-Docs-exported) document surfaced three
artifacts:

- The Title paragraph style is not in mammoth default style map, so the
  document title fell through as plain text. A styleMap now maps Title to
  h1 and Subtitle to h2 on top of the defaults.
- Bookmarks (every Google Docs heading has one) came out as empty inline
  anchors. Stripped.
- mammoth escapes punctuation conservatively; the backslashes are token
  noise for an LLM reader. Unescape characters that are never structural
  in Markdown, except a period after line-leading digits, where the
  escape is load-bearing.

tiny.docx fixture regenerated with a Title+bookmark paragraph and
punctuation (plus the styles.xml mammoth needs to resolve style names);
tests cover each cleanup and the list-guard edge.

Co-Authored-By: Claude Fable 5 <noreply@anthropic.com>
</commit_message>
<xml_diff>
--- a/test/fixtures/empty.docx
+++ b/test/fixtures/empty.docx
@@ -5,4 +5,15 @@
     <w:p/>
   </w:body>
 </w:document>
+</file>
+
+<file path=word/styles.xml><?xml version="1.0" encoding="utf-8"?>
+<w:styles xmlns:w="http://schemas.openxmlformats.org/wordprocessingml/2006/main">
+  <w:style w:type="paragraph" w:styleId="Title">
+    <w:name w:val="Title"/>
+  </w:style>
+  <w:style w:type="paragraph" w:styleId="Heading1">
+    <w:name w:val="heading 1"/>
+  </w:style>
+</w:styles>
 </file>
</xml_diff>